<commit_message>
feat: fitur docgen acroform selesai
</commit_message>
<xml_diff>
--- a/docs/PANDUAN_PENGGUNAAN.docx
+++ b/docs/PANDUAN_PENGGUNAAN.docx
@@ -1489,92 +1489,147 @@
         <w:spacing w:after="100" w:before="200"/>
       </w:pPr>
       <w:r>
-        <w:t xml:space="preserve">Step 1: Upload File</w:t>
-      </w:r>
-    </w:p>
-    <w:p/>
-    <w:p>
-      <w:pPr>
-        <w:spacing w:after="40" w:before="40"/>
-        <w:ind w:left="400"/>
-      </w:pPr>
-      <w:r>
-        <w:rPr>
-          <w:rFonts w:ascii="Calibri" w:cs="Calibri" w:eastAsia="Calibri" w:hAnsi="Calibri"/>
-          <w:sz w:val="22"/>
-          <w:szCs w:val="22"/>
-        </w:rPr>
-        <w:t xml:space="preserve">1. Drag &amp; Drop file PDF ke area drop zone, atau</w:t>
-      </w:r>
-    </w:p>
-    <w:p>
-      <w:pPr>
-        <w:spacing w:after="40" w:before="40"/>
-        <w:ind w:left="400"/>
-      </w:pPr>
-      <w:r>
-        <w:rPr>
-          <w:rFonts w:ascii="Calibri" w:cs="Calibri" w:eastAsia="Calibri" w:hAnsi="Calibri"/>
-          <w:sz w:val="22"/>
-          <w:szCs w:val="22"/>
-        </w:rPr>
-        <w:t xml:space="preserve">2. Klik tombol "Browse Files" untuk memilih file</w:t>
-      </w:r>
-    </w:p>
-    <w:p>
-      <w:pPr>
-        <w:spacing w:after="40" w:before="40"/>
-        <w:ind w:left="400"/>
-      </w:pPr>
-      <w:r>
-        <w:rPr>
-          <w:rFonts w:ascii="Calibri" w:cs="Calibri" w:eastAsia="Calibri" w:hAnsi="Calibri"/>
-          <w:sz w:val="22"/>
-          <w:szCs w:val="22"/>
-        </w:rPr>
-        <w:t xml:space="preserve">3. Hanya file PDF yang diterima (maks. 25MB)</w:t>
-      </w:r>
-    </w:p>
-    <w:p>
-      <w:pPr>
-        <w:spacing w:after="40" w:before="40"/>
-        <w:ind w:left="400"/>
-      </w:pPr>
-      <w:r>
-        <w:rPr>
-          <w:rFonts w:ascii="Calibri" w:cs="Calibri" w:eastAsia="Calibri" w:hAnsi="Calibri"/>
-          <w:sz w:val="22"/>
-          <w:szCs w:val="22"/>
-        </w:rPr>
-        <w:t xml:space="preserve">4. Setelah file terpilih, informasi file (nama + ukuran) akan ditampilkan</w:t>
-      </w:r>
-    </w:p>
-    <w:p>
-      <w:pPr>
-        <w:spacing w:after="40" w:before="40"/>
-        <w:ind w:left="400"/>
-      </w:pPr>
-      <w:r>
-        <w:rPr>
-          <w:rFonts w:ascii="Calibri" w:cs="Calibri" w:eastAsia="Calibri" w:hAnsi="Calibri"/>
-          <w:sz w:val="22"/>
-          <w:szCs w:val="22"/>
-        </w:rPr>
-        <w:t xml:space="preserve">5. Klik tombol ❌ untuk menghapus file dan memilih ulang</w:t>
-      </w:r>
-    </w:p>
-    <w:p>
-      <w:pPr>
-        <w:spacing w:after="40" w:before="40"/>
-        <w:ind w:left="400"/>
-      </w:pPr>
-      <w:r>
-        <w:rPr>
-          <w:rFonts w:ascii="Calibri" w:cs="Calibri" w:eastAsia="Calibri" w:hAnsi="Calibri"/>
-          <w:sz w:val="22"/>
-          <w:szCs w:val="22"/>
-        </w:rPr>
-        <w:t xml:space="preserve">6. Klik "Continue" untuk lanjut ke langkah berikutnya</w:t>
+        <w:t xml:space="preserve">Step 1: Upload File atau Generate Template</w:t>
+      </w:r>
+    </w:p>
+    <w:p/>
+    <w:p>
+      <w:pPr>
+        <w:spacing w:after="60" w:before="60"/>
+      </w:pPr>
+      <w:r>
+        <w:rPr>
+          <w:rFonts w:ascii="Calibri" w:cs="Calibri" w:eastAsia="Calibri" w:hAnsi="Calibri"/>
+          <w:sz w:val="22"/>
+          <w:szCs w:val="22"/>
+        </w:rPr>
+        <w:t xml:space="preserve">Di halaman Upload ini, terdapat dua mode pembuatan dokumen yang bisa Anda pilih:</w:t>
+      </w:r>
+    </w:p>
+    <w:p/>
+    <w:p>
+      <w:pPr>
+        <w:spacing w:after="60" w:before="60"/>
+      </w:pPr>
+      <w:r>
+        <w:rPr>
+          <w:rFonts w:ascii="Calibri" w:cs="Calibri" w:eastAsia="Calibri" w:hAnsi="Calibri"/>
+          <w:sz w:val="22"/>
+          <w:szCs w:val="22"/>
+        </w:rPr>
+        <w:t xml:space="preserve">Mode 1: Upload Existing PDF (Manual):</w:t>
+      </w:r>
+    </w:p>
+    <w:p>
+      <w:pPr>
+        <w:spacing w:after="40" w:before="40"/>
+        <w:ind w:left="400"/>
+      </w:pPr>
+      <w:r>
+        <w:rPr>
+          <w:rFonts w:ascii="Calibri" w:cs="Calibri" w:eastAsia="Calibri" w:hAnsi="Calibri"/>
+          <w:sz w:val="22"/>
+          <w:szCs w:val="22"/>
+        </w:rPr>
+        <w:t xml:space="preserve">1. Drag &amp; Drop file PDF yang sudah jadi ke area drop zone, atau klik tombol "Browse Files"</w:t>
+      </w:r>
+    </w:p>
+    <w:p>
+      <w:pPr>
+        <w:spacing w:after="40" w:before="40"/>
+        <w:ind w:left="400"/>
+      </w:pPr>
+      <w:r>
+        <w:rPr>
+          <w:rFonts w:ascii="Calibri" w:cs="Calibri" w:eastAsia="Calibri" w:hAnsi="Calibri"/>
+          <w:sz w:val="22"/>
+          <w:szCs w:val="22"/>
+        </w:rPr>
+        <w:t xml:space="preserve">2. Hanya file PDF yang diterima (maks. 25MB).</w:t>
+      </w:r>
+    </w:p>
+    <w:p/>
+    <w:p>
+      <w:pPr>
+        <w:spacing w:after="60" w:before="60"/>
+      </w:pPr>
+      <w:r>
+        <w:rPr>
+          <w:rFonts w:ascii="Calibri" w:cs="Calibri" w:eastAsia="Calibri" w:hAnsi="Calibri"/>
+          <w:sz w:val="22"/>
+          <w:szCs w:val="22"/>
+        </w:rPr>
+        <w:t xml:space="preserve">Mode 2: Generate from Template (Otomatis):</w:t>
+      </w:r>
+    </w:p>
+    <w:p>
+      <w:pPr>
+        <w:spacing w:after="40" w:before="40"/>
+        <w:ind w:left="400"/>
+      </w:pPr>
+      <w:r>
+        <w:rPr>
+          <w:rFonts w:ascii="Calibri" w:cs="Calibri" w:eastAsia="Calibri" w:hAnsi="Calibri"/>
+          <w:sz w:val="22"/>
+          <w:szCs w:val="22"/>
+        </w:rPr>
+        <w:t xml:space="preserve">1. Pilih Base Template yang telah dikonfigurasi oleh Administrator (misalnya: *Internal Memo Template*).</w:t>
+      </w:r>
+    </w:p>
+    <w:p>
+      <w:pPr>
+        <w:spacing w:after="40" w:before="40"/>
+        <w:ind w:left="400"/>
+      </w:pPr>
+      <w:r>
+        <w:rPr>
+          <w:rFonts w:ascii="Calibri" w:cs="Calibri" w:eastAsia="Calibri" w:hAnsi="Calibri"/>
+          <w:sz w:val="22"/>
+          <w:szCs w:val="22"/>
+        </w:rPr>
+        <w:t xml:space="preserve">2. Anda WAJIB memasukkan Judul Dokumen (Document Title) di kolom teratas. Judul ini akan otomatis digabung dengan jenis template sebagai nama akhir file Anda.</w:t>
+      </w:r>
+    </w:p>
+    <w:p>
+      <w:pPr>
+        <w:spacing w:after="40" w:before="40"/>
+        <w:ind w:left="400"/>
+      </w:pPr>
+      <w:r>
+        <w:rPr>
+          <w:rFonts w:ascii="Calibri" w:cs="Calibri" w:eastAsia="Calibri" w:hAnsi="Calibri"/>
+          <w:sz w:val="22"/>
+          <w:szCs w:val="22"/>
+        </w:rPr>
+        <w:t xml:space="preserve">3. Panel input lainnya akan memunculkan isian-*form* spesifik yang menempel di dalam template (seperti "Kepada", "Perihal", "Deskripsi"). Apabila *template* melibatkan properti numerik (seperti Harga), kolom total_price akan otomatis dikalkulasikan (Auto-Sum).</w:t>
+      </w:r>
+    </w:p>
+    <w:p>
+      <w:pPr>
+        <w:spacing w:after="40" w:before="40"/>
+        <w:ind w:left="400"/>
+      </w:pPr>
+      <w:r>
+        <w:rPr>
+          <w:rFonts w:ascii="Calibri" w:cs="Calibri" w:eastAsia="Calibri" w:hAnsi="Calibri"/>
+          <w:sz w:val="22"/>
+          <w:szCs w:val="22"/>
+        </w:rPr>
+        <w:t xml:space="preserve">4. Sistem akan menyuntikkan (menggabungkan) isian Anda ke dalam base PDF tersebut lalu mensterilisasi/mengunci strukturnya (Flatten/Read-Only Lock) secara otomatis.</w:t>
+      </w:r>
+    </w:p>
+    <w:p/>
+    <w:p>
+      <w:pPr>
+        <w:spacing w:after="60" w:before="60"/>
+      </w:pPr>
+      <w:r>
+        <w:rPr>
+          <w:rFonts w:ascii="Calibri" w:cs="Calibri" w:eastAsia="Calibri" w:hAnsi="Calibri"/>
+          <w:sz w:val="22"/>
+          <w:szCs w:val="22"/>
+        </w:rPr>
+        <w:t xml:space="preserve">Terakhir, klik "Continue" untuk lanjut ke langkah berikutnya.</w:t>
       </w:r>
     </w:p>
     <w:p/>
@@ -1711,21 +1766,35 @@
           <w:sz w:val="22"/>
           <w:szCs w:val="22"/>
         </w:rPr>
-        <w:t xml:space="preserve">3. (Opsional) Tambahkan Notes untuk informasi tambahan bagi approver</w:t>
-      </w:r>
-    </w:p>
-    <w:p>
-      <w:pPr>
-        <w:spacing w:after="40" w:before="40"/>
-        <w:ind w:left="400"/>
-      </w:pPr>
-      <w:r>
-        <w:rPr>
-          <w:rFonts w:ascii="Calibri" w:cs="Calibri" w:eastAsia="Calibri" w:hAnsi="Calibri"/>
-          <w:sz w:val="22"/>
-          <w:szCs w:val="22"/>
-        </w:rPr>
-        <w:t xml:space="preserve">4. Klik "Continue"</w:t>
+        <w:t xml:space="preserve">3. Pilih Department referensi (otomatis terisi dari Profil Anda sendiri - dapat diubah secara kasuistik untuk _cross-department_ upload).</w:t>
+      </w:r>
+    </w:p>
+    <w:p>
+      <w:pPr>
+        <w:spacing w:after="40" w:before="40"/>
+        <w:ind w:left="400"/>
+      </w:pPr>
+      <w:r>
+        <w:rPr>
+          <w:rFonts w:ascii="Calibri" w:cs="Calibri" w:eastAsia="Calibri" w:hAnsi="Calibri"/>
+          <w:sz w:val="22"/>
+          <w:szCs w:val="22"/>
+        </w:rPr>
+        <w:t xml:space="preserve">4. (Opsional) Tambahkan Notes untuk informasi tambahan bagi approver</w:t>
+      </w:r>
+    </w:p>
+    <w:p>
+      <w:pPr>
+        <w:spacing w:after="40" w:before="40"/>
+        <w:ind w:left="400"/>
+      </w:pPr>
+      <w:r>
+        <w:rPr>
+          <w:rFonts w:ascii="Calibri" w:cs="Calibri" w:eastAsia="Calibri" w:hAnsi="Calibri"/>
+          <w:sz w:val="22"/>
+          <w:szCs w:val="22"/>
+        </w:rPr>
+        <w:t xml:space="preserve">5. Klik "Continue"</w:t>
       </w:r>
     </w:p>
     <w:p/>
@@ -3806,6 +3875,48 @@
                 <w:sz w:val="20"/>
                 <w:szCs w:val="20"/>
               </w:rPr>
+              <w:t xml:space="preserve">Department</w:t>
+            </w:r>
+          </w:p>
+        </w:tc>
+        <w:tc>
+          <w:tcPr>
+            <w:tcW w:type="pct" w:w="50%"/>
+          </w:tcPr>
+          <w:p>
+            <w:pPr>
+              <w:spacing w:after="40" w:before="40"/>
+            </w:pPr>
+            <w:r>
+              <w:rPr>
+                <w:rFonts w:ascii="Calibri" w:cs="Calibri" w:eastAsia="Calibri" w:hAnsi="Calibri"/>
+                <w:b w:val="false"/>
+                <w:bCs w:val="false"/>
+                <w:sz w:val="20"/>
+                <w:szCs w:val="20"/>
+              </w:rPr>
+              <w:t xml:space="preserve">Tetapkan target HOD routing (e.g. `FO`, `HK`, `FB`)</w:t>
+            </w:r>
+          </w:p>
+        </w:tc>
+      </w:tr>
+      <w:tr>
+        <w:tc>
+          <w:tcPr>
+            <w:tcW w:type="pct" w:w="50%"/>
+          </w:tcPr>
+          <w:p>
+            <w:pPr>
+              <w:spacing w:after="40" w:before="40"/>
+            </w:pPr>
+            <w:r>
+              <w:rPr>
+                <w:rFonts w:ascii="Calibri" w:cs="Calibri" w:eastAsia="Calibri" w:hAnsi="Calibri"/>
+                <w:b w:val="false"/>
+                <w:bCs w:val="false"/>
+                <w:sz w:val="20"/>
+                <w:szCs w:val="20"/>
+              </w:rPr>
               <w:t xml:space="preserve">Branch</w:t>
             </w:r>
           </w:p>
@@ -6401,7 +6512,7 @@
         <w:spacing w:after="100" w:before="200"/>
       </w:pPr>
       <w:r>
-        <w:t xml:space="preserve">Q: Bagaimana format Document ID?</w:t>
+        <w:t xml:space="preserve">Q: Bagaimana format Document ID dan Nama File Akhir?</w:t>
       </w:r>
     </w:p>
     <w:p/>
@@ -6415,7 +6526,7 @@
           <w:sz w:val="22"/>
           <w:szCs w:val="22"/>
         </w:rPr>
-        <w:t xml:space="preserve">A: Format: [PREFIX]-[TAHUN]-[NOMOR]</w:t>
+        <w:t xml:space="preserve">A: Format Document ID: [PREFIX]-[TAHUN]-[NOMOR]</w:t>
       </w:r>
     </w:p>
     <w:p>
@@ -6472,6 +6583,33 @@
           <w:szCs w:val="22"/>
         </w:rPr>
         <w:t xml:space="preserve">• Memo → MM-2026-XXXX</w:t>
+      </w:r>
+    </w:p>
+    <w:p/>
+    <w:p>
+      <w:pPr>
+        <w:spacing w:after="60" w:before="60"/>
+      </w:pPr>
+      <w:r>
+        <w:rPr>
+          <w:rFonts w:ascii="Calibri" w:cs="Calibri" w:eastAsia="Calibri" w:hAnsi="Calibri"/>
+          <w:sz w:val="22"/>
+          <w:szCs w:val="22"/>
+        </w:rPr>
+        <w:t xml:space="preserve">Nama file akhir (PDF) yang tersimpan akan mengikuti nama asli dokumen yang Anda upload, disanitasi dari karakter khusus, dan ditambahkan DisplayID ini. </w:t>
+      </w:r>
+    </w:p>
+    <w:p>
+      <w:pPr>
+        <w:spacing w:after="60" w:before="60"/>
+      </w:pPr>
+      <w:r>
+        <w:rPr>
+          <w:rFonts w:ascii="Calibri" w:cs="Calibri" w:eastAsia="Calibri" w:hAnsi="Calibri"/>
+          <w:sz w:val="22"/>
+          <w:szCs w:val="22"/>
+        </w:rPr>
+        <w:t xml:space="preserve">Contoh: Invoice_Vendor_A_PO-2026-0042.pdf</w:t>
       </w:r>
     </w:p>
     <w:p/>

</xml_diff>